<commit_message>
feat: level 5 architectural alignment and IESS econometric audit
</commit_message>
<xml_diff>
--- a/writing/dist/index.docx
+++ b/writing/dist/index.docx
@@ -2,30 +2,6 @@
 <file path=word/document.xml><?xml version="1.0" encoding="utf-8"?>
 <w:document xmlns:w="http://schemas.openxmlformats.org/wordprocessingml/2006/main" xmlns:m="http://schemas.openxmlformats.org/officeDocument/2006/math" xmlns:r="http://schemas.openxmlformats.org/officeDocument/2006/relationships" xmlns:o="urn:schemas-microsoft-com:office:office" xmlns:v="urn:schemas-microsoft-com:vml" xmlns:w10="urn:schemas-microsoft-com:office:word" xmlns:a="http://schemas.openxmlformats.org/drawingml/2006/main" xmlns:pic="http://schemas.openxmlformats.org/drawingml/2006/picture" xmlns:wp="http://schemas.openxmlformats.org/drawingml/2006/wordprocessingDrawing">
   <w:body>
-    <w:p>
-      <w:pPr>
-        <w:pStyle w:val="Title"/>
-      </w:pPr>
-      <w:r>
-        <w:t xml:space="preserve">Análisis Econométrico: Unidad 1</w:t>
-      </w:r>
-    </w:p>
-    <w:p>
-      <w:pPr>
-        <w:pStyle w:val="Subtitle"/>
-      </w:pPr>
-      <w:r>
-        <w:t xml:space="preserve">Auditoría Forense y Modelización</w:t>
-      </w:r>
-    </w:p>
-    <w:p>
-      <w:pPr>
-        <w:pStyle w:val="Author"/>
-      </w:pPr>
-      <w:r>
-        <w:t xml:space="preserve">Erick Fabricio Condoy Seraquive</w:t>
-      </w:r>
-    </w:p>
     <w:sdt>
       <w:sdtPr>
         <w:docPartObj>
@@ -52,6 +28,132 @@
         </w:p>
       </w:sdtContent>
     </w:sdt>
+    <w:p>
+      <w:pPr>
+        <w:pStyle w:val="FirstParagraph"/>
+      </w:pPr>
+      <w:r>
+        <w:t xml:space="preserve">university:</w:t>
+      </w:r>
+      <w:r>
+        <w:t xml:space="preserve"> </w:t>
+      </w:r>
+      <w:r>
+        <w:t xml:space="preserve">“UNIVERSIDAD NACIONAL DE LOJA”</w:t>
+      </w:r>
+      <w:r>
+        <w:t xml:space="preserve"> </w:t>
+      </w:r>
+      <w:r>
+        <w:t xml:space="preserve">faculty:</w:t>
+      </w:r>
+      <w:r>
+        <w:t xml:space="preserve"> </w:t>
+      </w:r>
+      <w:r>
+        <w:t xml:space="preserve">“FACULTAD JURÍDICA, SOCIAL Y ADMINISTRATIVA”</w:t>
+      </w:r>
+      <w:r>
+        <w:t xml:space="preserve"> </w:t>
+      </w:r>
+      <w:r>
+        <w:t xml:space="preserve">school:</w:t>
+      </w:r>
+      <w:r>
+        <w:t xml:space="preserve"> </w:t>
+      </w:r>
+      <w:r>
+        <w:t xml:space="preserve">“CARRERA DE ECONOMÍA”</w:t>
+      </w:r>
+      <w:r>
+        <w:t xml:space="preserve"> </w:t>
+      </w:r>
+      <w:r>
+        <w:t xml:space="preserve">course:</w:t>
+      </w:r>
+      <w:r>
+        <w:t xml:space="preserve"> </w:t>
+      </w:r>
+      <w:r>
+        <w:t xml:space="preserve">“ECONOMETRÍA APLICADA”</w:t>
+      </w:r>
+    </w:p>
+    <w:p>
+      <w:pPr>
+        <w:pStyle w:val="BodyText"/>
+      </w:pPr>
+      <w:r>
+        <w:t xml:space="preserve">format:</w:t>
+      </w:r>
+      <w:r>
+        <w:t xml:space="preserve"> </w:t>
+      </w:r>
+      <w:r>
+        <w:t xml:space="preserve">html: default</w:t>
+      </w:r>
+      <w:r>
+        <w:t xml:space="preserve"> </w:t>
+      </w:r>
+      <w:r>
+        <w:t xml:space="preserve">pdf:</w:t>
+      </w:r>
+      <w:r>
+        <w:t xml:space="preserve"> </w:t>
+      </w:r>
+      <w:r>
+        <w:t xml:space="preserve">pdf-engine: lualatex</w:t>
+      </w:r>
+      <w:r>
+        <w:t xml:space="preserve"> </w:t>
+      </w:r>
+      <w:r>
+        <w:t xml:space="preserve">template: /home/erick-fcs/Capital_Workstation/capital-workstation-libs/src/ecs_quantitative/reporting/templates/academic_task.tex</w:t>
+      </w:r>
+      <w:r>
+        <w:t xml:space="preserve"> </w:t>
+      </w:r>
+      <w:r>
+        <w:t xml:space="preserve">toc: false</w:t>
+      </w:r>
+      <w:r>
+        <w:t xml:space="preserve"> </w:t>
+      </w:r>
+      <w:r>
+        <w:t xml:space="preserve">number-sections: true</w:t>
+      </w:r>
+      <w:r>
+        <w:t xml:space="preserve"> </w:t>
+      </w:r>
+      <w:r>
+        <w:t xml:space="preserve">citeproc: true</w:t>
+      </w:r>
+      <w:r>
+        <w:t xml:space="preserve"> </w:t>
+      </w:r>
+      <w:r>
+        <w:t xml:space="preserve">docx: default</w:t>
+      </w:r>
+    </w:p>
+    <w:p>
+      <w:pPr>
+        <w:pStyle w:val="BodyText"/>
+      </w:pPr>
+      <w:r>
+        <w:t xml:space="preserve">bibliography:</w:t>
+      </w:r>
+      <w:r>
+        <w:t xml:space="preserve"> </w:t>
+      </w:r>
+      <w:r>
+        <w:t xml:space="preserve">- /home/erick-fcs/Capital_Workstation/capital-workstation-libs/src/ecs_quantitative/reporting/assets/references.bib</w:t>
+      </w:r>
+      <w:r>
+        <w:t xml:space="preserve"> </w:t>
+      </w:r>
+      <w:r>
+        <w:t xml:space="preserve">csl: /home/erick-fcs/Capital_Workstation/capital-workstation-libs/src/ecs_quantitative/reporting/templates/apa_7.csl</w:t>
+      </w:r>
+    </w:p>
     <w:bookmarkStart w:id="9" w:name="resumen-ejecutivo"/>
     <w:p>
       <w:pPr>
@@ -102,7 +204,7 @@
         <w:pStyle w:val="FirstParagraph"/>
       </w:pPr>
       <w:r>
-        <w:t xml:space="preserve">Se aplicó un pipeline de ingesta inteligente que prioriza fuentes de API (World Bank) y realiza un fallback a archivos locales normalizados.</w:t>
+        <w:t xml:space="preserve">Se aplicó un pipeline de ingesta inteligente que prioriza fuentes de API provenientes del Banco Mundial y realiza un fallback a archivos locales normalizados.</w:t>
       </w:r>
     </w:p>
     <w:bookmarkEnd w:id="11"/>
@@ -217,7 +319,7 @@
         <w:pStyle w:val="FirstParagraph"/>
       </w:pPr>
       <w:r>
-        <w:t xml:space="preserve">La infraestructura de datos actual permite una transición fluida hacia modelos de estimación dinámicos (GMM, Panel Data).</w:t>
+        <w:t xml:space="preserve">La infraestructura de datos actual permite una transición fluida hacia modelos de estimación dinámicos tales como GMM o datos de panel.</w:t>
       </w:r>
     </w:p>
     <w:bookmarkEnd w:id="17"/>

</xml_diff>